<commit_message>
Apply live-manuscript honesty from later drafts; add Hogan/Roro/Bishai send pack
Take NW3 display, leading-contrast ACF, DJF cold-day identification, and
project-specific daily-recovery wording into Hogan's journal-track file only.
Leave the Sol Stage 3 report and poster byte-locked. Add a paste list and
three send-ready messages, with a climate-only attachable for Roro.

Co-authored-by: Shen Ruililin <bobshenruililin@users.noreply.github.com>
</commit_message>
<xml_diff>
--- a/manuscript/live_collaborative/Heat_CVD_Manuscript_20260812_collab_draft.docx
+++ b/manuscript/live_collaborative/Heat_CVD_Manuscript_20260812_collab_draft.docx
@@ -520,7 +520,7 @@
         <w:pStyle w:val="BodyText"/>
       </w:pPr>
       <w:r>
-        <w:t xml:space="preserve">Daily Headquarters series were aggregated to calendar months for analysis. Continuity exposures were monthly mean temperature, the monthly means of daily maximum and minimum temperature, and official counts of hot nights, very hot days, and cold days, the last three scaled per five days so that coefficients correspond to a five-day contrast rather than a single extreme day. Extremely hot days, relative humidity, rainfall, and sulfur dioxide were assembled with the weather series but were not entered in the twelve-contrast continuity panel. Fine particulate matter (PM2.5) from general EPD stations was assembled for staged pollution sensitivities. A station-month contributed to a pollutant mean only when at least 75% of expected observations were available; missing measurements were not coded as zero. Territory-wide monthly concentrations were unweighted means across eligible general stations. Roadside stations were reserved. Nitrogen dioxide and particulate matter were specified to enter before ozone, because ozone is coupled with hot, sunny conditions. Staged pollution models exist in the archive; they are not adjusted versions of the separate continuity panel and were not used to claim that confounding is resolved. Operational heatwave-spell and hot-month rules beyond the official daily thresholds remain with the weather co-investigator; provisional monthly-tail indicators were not used as confirmatory exposures.</w:t>
+        <w:t xml:space="preserve">Daily Headquarters series were aggregated to calendar months for analysis. Continuity exposures were monthly mean temperature, the monthly means of daily maximum and minimum temperature, and official counts of hot nights, very hot days, and cold days, the last three scaled per five days so that coefficients correspond to a five-day contrast rather than a single extreme day. Official cold days were concentrated in December–February (141 of 145 days across 2013–2023; four days fell in March). With calendar-month indicators in the model, remaining cold-day variation is between-year differences within winter months. A winter-only restriction is a labelled sensitivity, not a remedy for that identification. Extremely hot days, relative humidity, rainfall, and sulfur dioxide were assembled with the weather series but were not entered in the twelve-contrast continuity panel. Fine particulate matter (PM2.5) from general EPD stations was assembled for staged pollution sensitivities. A station-month contributed to a pollutant mean only when at least 75% of expected observations were available; missing measurements were not coded as zero. Territory-wide monthly concentrations were unweighted means across eligible general stations. Roadside stations were reserved. Nitrogen dioxide and particulate matter were specified to enter before ozone, because ozone is coupled with hot, sunny conditions. Staged pollution models exist in the archive; they are not adjusted versions of the separate continuity panel and were not used to claim that confounding is resolved. Operational heatwave-spell and hot-month rules beyond the official daily thresholds remain with the weather co-investigator; provisional monthly-tail indicators were not used as confirmatory exposures.</w:t>
       </w:r>
     </w:p>
     <w:bookmarkEnd w:id="24"/>
@@ -707,7 +707,7 @@
         <w:pStyle w:val="FirstParagraph"/>
       </w:pPr>
       <w:r>
-        <w:t xml:space="preserve">A constrained method for recovering daily exposure coefficients from monthly sums was evaluated in simulation against Hong Kong weather, following the Basagaña–Ballester aggregation framework [15,16]. Implementation was from the published estimating equation. Public code without a repository licence was not copied. Synthetic daily outcomes were matched to disclosure-minimised seasonality, scale, overdispersion, and residual dependence of the monthly series. Admission of any real daily coefficient required all frozen calibration gates to pass, including Type I error, coverage, relative bias, and sign recovery. The method failed those gates. No daily health coefficient was produced. A full daily distributed-lag non-linear model is not identified from 132 monthly sums.</w:t>
+        <w:t xml:space="preserve">A constrained method for recovering daily exposure coefficients from monthly sums was evaluated in simulation against Hong Kong weather, following the Basagaña–Ballester aggregation framework [15,16]. Implementation was from the published estimating equation. Public code without a repository licence was not copied. Synthetic daily outcomes were matched to disclosure-minimised seasonality, scale, overdispersion, and residual dependence of the monthly series. Admission of any real daily coefficient required all frozen calibration gates to pass, including Type I error, coverage, relative bias, and sign recovery. A 500-replicate calibration against Hong Kong weather failed those requirements. A subsequent worst-cell re-summary of the same fits did not reverse that decision. No daily health coefficient was produced. This is a project-specific calibration result. It does not show that the Basagaña–Ballester method fails in general. A full daily distributed-lag non-linear model is not identified from 132 monthly sums.</w:t>
       </w:r>
     </w:p>
     <w:bookmarkEnd w:id="28"/>
@@ -2257,7 +2257,7 @@
         <w:pStyle w:val="BodyText"/>
       </w:pPr>
       <w:r>
-        <w:t xml:space="preserve">Pearson residual autocorrelation at lag 1 was 0.51–0.53 for CHD continuity models and 0.13–0.18 for HF. Ljung–Box tests at lag 6 rejected residual white noise for CHD (</w:t>
+        <w:t xml:space="preserve">Pearson residual autocorrelation at lag 1 was 0.51–0.53 for CHD continuity models and 0.13–0.18 for HF. For the two leading contrasts it was 0.508 (CHD hot nights) and 0.146 (HF cold days). Ljung–Box tests at lag 6 rejected residual white noise for CHD (</w:t>
       </w:r>
       <w:r>
         <w:rPr>
@@ -2292,7 +2292,7 @@
         <w:t xml:space="preserve"> </w:t>
       </w:r>
       <w:r>
-        <w:t xml:space="preserve">&gt; 0.3). Serial dependence is part of the inferential problem for CHD.</w:t>
+        <w:t xml:space="preserve">&gt; 0.3). Serial dependence is part of the inferential problem for CHD. It is why Newey–West intervals are shown rather than model-based intervals alone.</w:t>
       </w:r>
     </w:p>
     <w:p>
@@ -2308,7 +2308,7 @@
         <w:pStyle w:val="BodyText"/>
       </w:pPr>
       <w:r>
-        <w:t xml:space="preserve">The simulated daily-recovery method failed its worst-cell gates (null Type I error 0.048–0.150; minimum coverage 0.840; maximum non-null relative bias 32.8; maximum moderate false-sign rate 0.808). No real daily coefficient is reported.</w:t>
+        <w:t xml:space="preserve">The simulated daily-recovery method failed its worst-cell gates (null Type I error 0.048–0.150; minimum coverage 0.840; maximum non-null relative bias 32.8; maximum moderate false-sign rate 0.808). No real daily coefficient is reported. That refusal is specific to this monthly series and this implementation.</w:t>
       </w:r>
     </w:p>
     <w:bookmarkEnd w:id="36"/>
@@ -2353,7 +2353,7 @@
         <w:t xml:space="preserve">q</w:t>
       </w:r>
       <w:r>
-        <w:t xml:space="preserve">-unprotected. The CHD hot-night association is smaller and depends on the uncertainty method.</w:t>
+        <w:t xml:space="preserve">-unprotected. Because official cold days fall almost entirely in December–February, that residual is a between-year winter contrast, not a summer-versus-winter contrast. The CHD hot-night association is smaller and depends on the uncertainty method.</w:t>
       </w:r>
     </w:p>
     <w:p>
@@ -2429,7 +2429,7 @@
         <w:pStyle w:val="BodyText"/>
       </w:pPr>
       <w:r>
-        <w:t xml:space="preserve">Limitations. Admission cause was not recorded. Inpatient-only semantics remain unconfirmed. Cohort person-time still at risk of a first event was unavailable. The analysis is ecological and monthly [14]. Age, sex, and subtype strata were not delivered. CHD residual serial correlation remains material. Weather hot-month and cold-month reference rules remain unlocked. Pollution, humidity, and influenza confounding is unresolved in the continuity panel. External dissemination of the governed aggregates still requires confirmation from the outcome and supervising investigators.</w:t>
+        <w:t xml:space="preserve">Limitations. Admission cause was not recorded. Inpatient-only semantics remain unconfirmed. Cohort person-time still at risk of a first event was unavailable. The analysis is ecological and monthly [14]. Age, sex, and subtype strata were not delivered. CHD residual serial correlation remains material. Official cold-day counts are winter-concentrated, so the HF cold-day residual is identified from between-year winter differences. Weather hot-month and cold-month reference rules remain unlocked. Pollution, humidity, and influenza confounding is unresolved in the continuity panel. External dissemination of the governed aggregates still requires confirmation from the outcome and supervising investigators.</w:t>
       </w:r>
     </w:p>
     <w:bookmarkEnd w:id="40"/>

</xml_diff>